<commit_message>
docs: refresh USAGE.docx with screenshots gallery section
Adds a section that maps every UI route to the matching PNG under
docs/screenshots/ so a reader can see what the dashboard is supposed
to look like without running the stack first, plus the one-line
recipe for re-capturing with Playwright. Re-emitted from the
generator script so the binary stays in sync.
</commit_message>
<xml_diff>
--- a/docs/USAGE.docx
+++ b/docs/USAGE.docx
@@ -4429,7 +4429,327 @@
         <w:pStyle w:val="Heading1"/>
       </w:pPr>
       <w:r>
-        <w:t>17. Re-running this guide</w:t>
+        <w:t>17. Screenshots gallery</w:t>
+      </w:r>
+    </w:p>
+    <w:p>
+      <w:pPr>
+        <w:spacing w:after="120"/>
+      </w:pPr>
+      <w:r>
+        <w:t>Full-page captures of every dashboard route live under docs/screenshots/. They sit alongside this guide so a reader can see what the UI is supposed to look like without running the stack first. Each PNG maps one-to-one with a route in section 8:</w:t>
+      </w:r>
+    </w:p>
+    <w:tbl>
+      <w:tblPr>
+        <w:tblStyle w:val="LightGrid-Accent1"/>
+        <w:tblW w:type="auto" w:w="0"/>
+        <w:tblLook w:firstColumn="1" w:firstRow="1" w:lastColumn="0" w:lastRow="0" w:noHBand="0" w:noVBand="1" w:val="04A0"/>
+      </w:tblPr>
+      <w:tblGrid>
+        <w:gridCol w:w="4320"/>
+        <w:gridCol w:w="4320"/>
+      </w:tblGrid>
+      <w:tr>
+        <w:tc>
+          <w:tcPr>
+            <w:tcW w:type="dxa" w:w="4320"/>
+          </w:tcPr>
+          <w:p>
+            <w:r>
+              <w:rPr>
+                <w:b/>
+              </w:rPr>
+              <w:t>Route</w:t>
+            </w:r>
+          </w:p>
+        </w:tc>
+        <w:tc>
+          <w:tcPr>
+            <w:tcW w:type="dxa" w:w="4320"/>
+          </w:tcPr>
+          <w:p>
+            <w:r>
+              <w:rPr>
+                <w:b/>
+              </w:rPr>
+              <w:t>File</w:t>
+            </w:r>
+          </w:p>
+        </w:tc>
+      </w:tr>
+      <w:tr>
+        <w:tc>
+          <w:tcPr>
+            <w:tcW w:type="dxa" w:w="4320"/>
+          </w:tcPr>
+          <w:p>
+            <w:r>
+              <w:t>/</w:t>
+            </w:r>
+          </w:p>
+        </w:tc>
+        <w:tc>
+          <w:tcPr>
+            <w:tcW w:type="dxa" w:w="4320"/>
+          </w:tcPr>
+          <w:p>
+            <w:r>
+              <w:t>docs/screenshots/dashboard.png</w:t>
+            </w:r>
+          </w:p>
+        </w:tc>
+      </w:tr>
+      <w:tr>
+        <w:tc>
+          <w:tcPr>
+            <w:tcW w:type="dxa" w:w="4320"/>
+          </w:tcPr>
+          <w:p>
+            <w:r>
+              <w:t>/issues</w:t>
+            </w:r>
+          </w:p>
+        </w:tc>
+        <w:tc>
+          <w:tcPr>
+            <w:tcW w:type="dxa" w:w="4320"/>
+          </w:tcPr>
+          <w:p>
+            <w:r>
+              <w:t>docs/screenshots/issues-list.png</w:t>
+            </w:r>
+          </w:p>
+        </w:tc>
+      </w:tr>
+      <w:tr>
+        <w:tc>
+          <w:tcPr>
+            <w:tcW w:type="dxa" w:w="4320"/>
+          </w:tcPr>
+          <w:p>
+            <w:r>
+              <w:t>/issues/new</w:t>
+            </w:r>
+          </w:p>
+        </w:tc>
+        <w:tc>
+          <w:tcPr>
+            <w:tcW w:type="dxa" w:w="4320"/>
+          </w:tcPr>
+          <w:p>
+            <w:r>
+              <w:t>docs/screenshots/issues-new.png</w:t>
+            </w:r>
+          </w:p>
+        </w:tc>
+      </w:tr>
+      <w:tr>
+        <w:tc>
+          <w:tcPr>
+            <w:tcW w:type="dxa" w:w="4320"/>
+          </w:tcPr>
+          <w:p>
+            <w:r>
+              <w:t>/issues/{key}</w:t>
+            </w:r>
+          </w:p>
+        </w:tc>
+        <w:tc>
+          <w:tcPr>
+            <w:tcW w:type="dxa" w:w="4320"/>
+          </w:tcPr>
+          <w:p>
+            <w:r>
+              <w:t>docs/screenshots/issue-detail.png</w:t>
+            </w:r>
+          </w:p>
+        </w:tc>
+      </w:tr>
+      <w:tr>
+        <w:tc>
+          <w:tcPr>
+            <w:tcW w:type="dxa" w:w="4320"/>
+          </w:tcPr>
+          <w:p>
+            <w:r>
+              <w:t>/projects</w:t>
+            </w:r>
+          </w:p>
+        </w:tc>
+        <w:tc>
+          <w:tcPr>
+            <w:tcW w:type="dxa" w:w="4320"/>
+          </w:tcPr>
+          <w:p>
+            <w:r>
+              <w:t>docs/screenshots/projects-list.png</w:t>
+            </w:r>
+          </w:p>
+        </w:tc>
+      </w:tr>
+      <w:tr>
+        <w:tc>
+          <w:tcPr>
+            <w:tcW w:type="dxa" w:w="4320"/>
+          </w:tcPr>
+          <w:p>
+            <w:r>
+              <w:t>/projects/{key}</w:t>
+            </w:r>
+          </w:p>
+        </w:tc>
+        <w:tc>
+          <w:tcPr>
+            <w:tcW w:type="dxa" w:w="4320"/>
+          </w:tcPr>
+          <w:p>
+            <w:r>
+              <w:t>docs/screenshots/project-detail.png</w:t>
+            </w:r>
+          </w:p>
+        </w:tc>
+      </w:tr>
+      <w:tr>
+        <w:tc>
+          <w:tcPr>
+            <w:tcW w:type="dxa" w:w="4320"/>
+          </w:tcPr>
+          <w:p>
+            <w:r>
+              <w:t>/sprints</w:t>
+            </w:r>
+          </w:p>
+        </w:tc>
+        <w:tc>
+          <w:tcPr>
+            <w:tcW w:type="dxa" w:w="4320"/>
+          </w:tcPr>
+          <w:p>
+            <w:r>
+              <w:t>docs/screenshots/sprints.png</w:t>
+            </w:r>
+          </w:p>
+        </w:tc>
+      </w:tr>
+      <w:tr>
+        <w:tc>
+          <w:tcPr>
+            <w:tcW w:type="dxa" w:w="4320"/>
+          </w:tcPr>
+          <w:p>
+            <w:r>
+              <w:t>/analytics</w:t>
+            </w:r>
+          </w:p>
+        </w:tc>
+        <w:tc>
+          <w:tcPr>
+            <w:tcW w:type="dxa" w:w="4320"/>
+          </w:tcPr>
+          <w:p>
+            <w:r>
+              <w:t>docs/screenshots/analytics.png</w:t>
+            </w:r>
+          </w:p>
+        </w:tc>
+      </w:tr>
+      <w:tr>
+        <w:tc>
+          <w:tcPr>
+            <w:tcW w:type="dxa" w:w="4320"/>
+          </w:tcPr>
+          <w:p>
+            <w:r>
+              <w:t>/chat</w:t>
+            </w:r>
+          </w:p>
+        </w:tc>
+        <w:tc>
+          <w:tcPr>
+            <w:tcW w:type="dxa" w:w="4320"/>
+          </w:tcPr>
+          <w:p>
+            <w:r>
+              <w:t>docs/screenshots/chat.png</w:t>
+            </w:r>
+          </w:p>
+        </w:tc>
+      </w:tr>
+      <w:tr>
+        <w:tc>
+          <w:tcPr>
+            <w:tcW w:type="dxa" w:w="4320"/>
+          </w:tcPr>
+          <w:p>
+            <w:r>
+              <w:t>/settings</w:t>
+            </w:r>
+          </w:p>
+        </w:tc>
+        <w:tc>
+          <w:tcPr>
+            <w:tcW w:type="dxa" w:w="4320"/>
+          </w:tcPr>
+          <w:p>
+            <w:r>
+              <w:t>docs/screenshots/settings.png</w:t>
+            </w:r>
+          </w:p>
+        </w:tc>
+      </w:tr>
+    </w:tbl>
+    <w:p>
+      <w:pPr>
+        <w:spacing w:after="120"/>
+      </w:pPr>
+      <w:r>
+        <w:t>Re-capture from the running stack with:</w:t>
+      </w:r>
+    </w:p>
+    <w:tbl>
+      <w:tblPr>
+        <w:tblW w:type="auto" w:w="0"/>
+        <w:tblLayout w:type="fixed"/>
+        <w:tblLook w:firstColumn="1" w:firstRow="1" w:lastColumn="0" w:lastRow="0" w:noHBand="0" w:noVBand="1" w:val="04A0"/>
+      </w:tblPr>
+      <w:tblGrid>
+        <w:gridCol w:w="8640"/>
+      </w:tblGrid>
+      <w:tr>
+        <w:tc>
+          <w:tcPr>
+            <w:tcW w:type="dxa" w:w="9071"/>
+            <w:vAlign w:val="top"/>
+            <w:shd w:val="clear" w:color="auto" w:fill="F4F4F4"/>
+          </w:tcPr>
+          <w:p>
+            <w:pPr>
+              <w:spacing w:before="40" w:after="40"/>
+            </w:pPr>
+            <w:r>
+              <w:rPr>
+                <w:rFonts w:ascii="Consolas" w:hAnsi="Consolas"/>
+                <w:color w:val="202020"/>
+                <w:sz w:val="18"/>
+              </w:rPr>
+              <w:t>pip install playwright &amp;&amp; playwright install chromium</w:t>
+              <w:br/>
+              <w:t>docker-compose --profile ui up -d   # or 'cd web &amp;&amp; npm run dev'</w:t>
+              <w:br/>
+              <w:t>python scripts/capture_screenshots.py</w:t>
+              <w:br/>
+            </w:r>
+          </w:p>
+        </w:tc>
+      </w:tr>
+    </w:tbl>
+    <w:p>
+      <w:pPr>
+        <w:pStyle w:val="Heading1"/>
+      </w:pPr>
+      <w:r>
+        <w:t>18. Re-running this guide</w:t>
       </w:r>
     </w:p>
     <w:p>

</xml_diff>